<commit_message>
add link ytb for word
</commit_message>
<xml_diff>
--- a/LAB1/Lap1_11CNPM2_1150080156_NguyenHoTruongTam.docx
+++ b/LAB1/Lap1_11CNPM2_1150080156_NguyenHoTruongTam.docx
@@ -4,7 +4,9 @@
   <w:body>
     <w:p>
       <w:pPr>
-        <w:rPr>
+        <w:jc w:val="center"/>
+        <w:rPr>
+          <w:rFonts w:ascii="Times New Roman" w:hAnsi="Times New Roman" w:cs="Times New Roman"/>
           <w:b/>
           <w:bCs/>
           <w:lang w:val="vi-VN"/>
@@ -12,81 +14,77 @@
       </w:pPr>
       <w:r>
         <w:rPr>
+          <w:rFonts w:ascii="Times New Roman" w:hAnsi="Times New Roman" w:cs="Times New Roman"/>
           <w:b/>
           <w:bCs/>
-        </w:rPr>
-        <w:t>1. Thiết lập môi trường</w:t>
+          <w:lang w:val="vi-VN"/>
+        </w:rPr>
+        <w:t>NGUYỄN HỒ TRƯỜNG TAM_11CNPM2_1150080156</w:t>
       </w:r>
     </w:p>
     <w:p>
       <w:pPr>
-        <w:rPr>
-          <w:lang w:val="vi-VN"/>
-        </w:rPr>
-      </w:pPr>
-      <w:r>
-        <w:rPr>
+        <w:jc w:val="center"/>
+        <w:rPr>
+          <w:rFonts w:ascii="Times New Roman" w:hAnsi="Times New Roman" w:cs="Times New Roman"/>
           <w:b/>
           <w:bCs/>
-        </w:rPr>
-        <w:t>Chuyển đổi cấu hình mạng (Network):</w:t>
-      </w:r>
-      <w:r>
-        <w:t xml:space="preserve"> </w:t>
-      </w:r>
-      <w:r>
-        <w:rPr>
+          <w:lang w:val="vi-VN"/>
+        </w:rPr>
+      </w:pPr>
+      <w:r>
+        <w:rPr>
+          <w:rFonts w:ascii="Times New Roman" w:hAnsi="Times New Roman" w:cs="Times New Roman"/>
           <w:b/>
           <w:bCs/>
-        </w:rPr>
-        <w:t>Settings &gt; Network</w:t>
-      </w:r>
-      <w:r>
-        <w:t xml:space="preserve">, chuyển </w:t>
-      </w:r>
-      <w:r>
-        <w:rPr>
-          <w:i/>
-          <w:iCs/>
-        </w:rPr>
-        <w:t>Attached to</w:t>
-      </w:r>
-      <w:r>
-        <w:t xml:space="preserve"> từ </w:t>
-      </w:r>
-      <w:r>
-        <w:rPr>
+          <w:lang w:val="vi-VN"/>
+        </w:rPr>
+        <w:t>BÀI LAB 1</w:t>
+      </w:r>
+    </w:p>
+    <w:p>
+      <w:pPr>
+        <w:pStyle w:val="ListParagraph"/>
+        <w:numPr>
+          <w:ilvl w:val="0"/>
+          <w:numId w:val="1"/>
+        </w:numPr>
+        <w:rPr>
+          <w:rFonts w:ascii="Times New Roman" w:hAnsi="Times New Roman" w:cs="Times New Roman"/>
           <w:b/>
           <w:bCs/>
-        </w:rPr>
-        <w:t>NAT</w:t>
-      </w:r>
-      <w:r>
-        <w:t xml:space="preserve"> sang </w:t>
-      </w:r>
-      <w:r>
-        <w:rPr>
+          <w:lang w:val="vi-VN"/>
+        </w:rPr>
+      </w:pPr>
+      <w:r>
+        <w:rPr>
+          <w:rFonts w:ascii="Times New Roman" w:hAnsi="Times New Roman" w:cs="Times New Roman"/>
           <w:b/>
           <w:bCs/>
-        </w:rPr>
-        <w:t>Internal Network</w:t>
-      </w:r>
-      <w:r>
-        <w:t xml:space="preserve"> cho tất cả các máy ảo tham gia bài lab.</w:t>
+          <w:lang w:val="vi-VN"/>
+        </w:rPr>
+        <w:t>PING từ Windows 10 đến Kali</w:t>
       </w:r>
     </w:p>
     <w:p>
       <w:pPr>
-        <w:rPr>
-          <w:lang w:val="vi-VN"/>
-        </w:rPr>
-      </w:pPr>
-      <w:r>
+        <w:pStyle w:val="ListParagraph"/>
+        <w:keepNext/>
+        <w:rPr>
+          <w:rFonts w:ascii="Times New Roman" w:hAnsi="Times New Roman" w:cs="Times New Roman"/>
+        </w:rPr>
+      </w:pPr>
+      <w:r>
+        <w:rPr>
+          <w:rFonts w:ascii="Times New Roman" w:hAnsi="Times New Roman" w:cs="Times New Roman"/>
+          <w:noProof/>
+          <w:lang w:val="vi-VN"/>
+        </w:rPr>
         <w:drawing>
-          <wp:inline distT="0" distB="0" distL="0" distR="0" wp14:anchorId="5AE94544" wp14:editId="5A5900D7">
-            <wp:extent cx="5943600" cy="3337560"/>
-            <wp:effectExtent l="0" t="0" r="0" b="0"/>
-            <wp:docPr id="182790741" name="Picture 1" descr="A screenshot of a computer&#10;&#10;AI-generated content may be incorrect."/>
+          <wp:inline distT="0" distB="0" distL="0" distR="0" wp14:anchorId="058EBB04" wp14:editId="6C3D3DC5">
+            <wp:extent cx="5943600" cy="4457700"/>
+            <wp:effectExtent l="0" t="0" r="6985" b="0"/>
+            <wp:docPr id="1698233254" name="Picture 1" descr="A computer screen shot of a computer screen&#10;&#10;AI-generated content may be incorrect."/>
             <wp:cNvGraphicFramePr>
               <a:graphicFrameLocks xmlns:a="http://schemas.openxmlformats.org/drawingml/2006/main" noChangeAspect="1"/>
             </wp:cNvGraphicFramePr>
@@ -94,11 +92,17 @@
               <a:graphicData uri="http://schemas.openxmlformats.org/drawingml/2006/picture">
                 <pic:pic xmlns:pic="http://schemas.openxmlformats.org/drawingml/2006/picture">
                   <pic:nvPicPr>
-                    <pic:cNvPr id="182790741" name="Picture 1" descr="A screenshot of a computer&#10;&#10;AI-generated content may be incorrect."/>
+                    <pic:cNvPr id="1698233254" name="Picture 1" descr="A computer screen shot of a computer screen&#10;&#10;AI-generated content may be incorrect."/>
                     <pic:cNvPicPr/>
                   </pic:nvPicPr>
                   <pic:blipFill>
-                    <a:blip r:embed="rId4"/>
+                    <a:blip r:embed="rId6">
+                      <a:extLst>
+                        <a:ext uri="{28A0092B-C50C-407E-A947-70E740481C1C}">
+                          <a14:useLocalDpi xmlns:a14="http://schemas.microsoft.com/office/drawing/2010/main" val="0"/>
+                        </a:ext>
+                      </a:extLst>
+                    </a:blip>
                     <a:stretch>
                       <a:fillRect/>
                     </a:stretch>
@@ -106,7 +110,7 @@
                   <pic:spPr>
                     <a:xfrm>
                       <a:off x="0" y="0"/>
-                      <a:ext cx="5943600" cy="3337560"/>
+                      <a:ext cx="5943600" cy="4457700"/>
                     </a:xfrm>
                     <a:prstGeom prst="rect">
                       <a:avLst/>
@@ -121,32 +125,133 @@
     </w:p>
     <w:p>
       <w:pPr>
-        <w:rPr>
-          <w:lang w:val="vi-VN"/>
-        </w:rPr>
-      </w:pPr>
-      <w:r>
-        <w:rPr>
-          <w:lang w:val="vi-VN"/>
-        </w:rPr>
-        <w:t>Chạy máy ảo Win10</w:t>
+        <w:pStyle w:val="Caption"/>
+        <w:jc w:val="center"/>
+        <w:rPr>
+          <w:rFonts w:ascii="Times New Roman" w:hAnsi="Times New Roman" w:cs="Times New Roman"/>
+          <w:lang w:val="vi-VN"/>
+        </w:rPr>
+      </w:pPr>
+      <w:r>
+        <w:rPr>
+          <w:rFonts w:ascii="Times New Roman" w:hAnsi="Times New Roman" w:cs="Times New Roman"/>
+        </w:rPr>
+        <w:t xml:space="preserve">Hình </w:t>
+      </w:r>
+      <w:r>
+        <w:rPr>
+          <w:rFonts w:ascii="Times New Roman" w:hAnsi="Times New Roman" w:cs="Times New Roman"/>
+        </w:rPr>
+        <w:fldChar w:fldCharType="begin"/>
+      </w:r>
+      <w:r>
+        <w:rPr>
+          <w:rFonts w:ascii="Times New Roman" w:hAnsi="Times New Roman" w:cs="Times New Roman"/>
+        </w:rPr>
+        <w:instrText xml:space="preserve"> SEQ Hình \* ARABIC </w:instrText>
+      </w:r>
+      <w:r>
+        <w:rPr>
+          <w:rFonts w:ascii="Times New Roman" w:hAnsi="Times New Roman" w:cs="Times New Roman"/>
+        </w:rPr>
+        <w:fldChar w:fldCharType="separate"/>
+      </w:r>
+      <w:r>
+        <w:rPr>
+          <w:rFonts w:ascii="Times New Roman" w:hAnsi="Times New Roman" w:cs="Times New Roman"/>
+          <w:noProof/>
+        </w:rPr>
+        <w:t>1</w:t>
+      </w:r>
+      <w:r>
+        <w:rPr>
+          <w:rFonts w:ascii="Times New Roman" w:hAnsi="Times New Roman" w:cs="Times New Roman"/>
+        </w:rPr>
+        <w:fldChar w:fldCharType="end"/>
+      </w:r>
+      <w:r>
+        <w:rPr>
+          <w:rFonts w:ascii="Times New Roman" w:hAnsi="Times New Roman" w:cs="Times New Roman"/>
+          <w:lang w:val="vi-VN"/>
+        </w:rPr>
+        <w:t>. Kiểm tra kết nối mạng từ Windows 10 đến Kali Linux</w:t>
       </w:r>
     </w:p>
     <w:p>
       <w:pPr>
-        <w:rPr>
-          <w:lang w:val="vi-VN"/>
-        </w:rPr>
-      </w:pPr>
-      <w:r>
-        <w:rPr>
+        <w:ind w:firstLine="720"/>
+        <w:rPr>
+          <w:rFonts w:ascii="Times New Roman" w:hAnsi="Times New Roman" w:cs="Times New Roman"/>
+          <w:sz w:val="26"/>
+          <w:szCs w:val="26"/>
+          <w:lang w:val="vi-VN"/>
+        </w:rPr>
+      </w:pPr>
+      <w:r>
+        <w:rPr>
+          <w:rFonts w:ascii="Times New Roman" w:hAnsi="Times New Roman" w:cs="Times New Roman"/>
+          <w:sz w:val="26"/>
+          <w:szCs w:val="26"/>
+          <w:lang w:val="vi-VN"/>
+        </w:rPr>
+        <w:t>Thực hiện lệnh ping 10.0.0.3 trên Windows 10 để kiểm tra kết nối đến Kali Linux. Kết quả nhận được 4/4 gói tin, không mất gói, cho thấy hai máy có thể kết nối với nhau qua mạng Internal Network.</w:t>
+      </w:r>
+    </w:p>
+    <w:p>
+      <w:pPr>
+        <w:pStyle w:val="ListParagraph"/>
+        <w:numPr>
+          <w:ilvl w:val="0"/>
+          <w:numId w:val="1"/>
+        </w:numPr>
+        <w:rPr>
+          <w:rFonts w:ascii="Times New Roman" w:hAnsi="Times New Roman" w:cs="Times New Roman"/>
+          <w:b/>
+          <w:bCs/>
+          <w:lang w:val="vi-VN"/>
+        </w:rPr>
+      </w:pPr>
+      <w:r>
+        <w:rPr>
+          <w:rFonts w:ascii="Times New Roman" w:hAnsi="Times New Roman" w:cs="Times New Roman"/>
+          <w:b/>
+          <w:bCs/>
+          <w:lang w:val="vi-VN"/>
+        </w:rPr>
+        <w:br w:type="column"/>
+      </w:r>
+      <w:r>
+        <w:rPr>
+          <w:rFonts w:ascii="Times New Roman" w:hAnsi="Times New Roman" w:cs="Times New Roman"/>
+          <w:b/>
+          <w:bCs/>
+          <w:lang w:val="vi-VN"/>
+        </w:rPr>
+        <w:lastRenderedPageBreak/>
+        <w:t>PING từ Kali về Windows 10</w:t>
+      </w:r>
+    </w:p>
+    <w:p>
+      <w:pPr>
+        <w:keepNext/>
+        <w:ind w:left="360"/>
+        <w:rPr>
+          <w:rFonts w:ascii="Times New Roman" w:hAnsi="Times New Roman" w:cs="Times New Roman"/>
+        </w:rPr>
+      </w:pPr>
+      <w:r>
+        <w:rPr>
+          <w:rFonts w:ascii="Times New Roman" w:hAnsi="Times New Roman" w:cs="Times New Roman"/>
+          <w:b/>
+          <w:bCs/>
+          <w:noProof/>
           <w:lang w:val="vi-VN"/>
         </w:rPr>
         <w:drawing>
-          <wp:inline distT="0" distB="0" distL="0" distR="0" wp14:anchorId="466F2A7F" wp14:editId="5F85FE53">
-            <wp:extent cx="5943600" cy="3159125"/>
+          <wp:inline distT="0" distB="0" distL="0" distR="0" wp14:anchorId="67B917D2" wp14:editId="3E259F86">
+            <wp:extent cx="5943600" cy="2854325"/>
             <wp:effectExtent l="0" t="0" r="0" b="3175"/>
-            <wp:docPr id="1020297675" name="Picture 1" descr="A screenshot of a computer&#10;&#10;AI-generated content may be incorrect."/>
+            <wp:docPr id="385780445" name="Picture 2"/>
             <wp:cNvGraphicFramePr>
               <a:graphicFrameLocks xmlns:a="http://schemas.openxmlformats.org/drawingml/2006/main" noChangeAspect="1"/>
             </wp:cNvGraphicFramePr>
@@ -154,11 +259,17 @@
               <a:graphicData uri="http://schemas.openxmlformats.org/drawingml/2006/picture">
                 <pic:pic xmlns:pic="http://schemas.openxmlformats.org/drawingml/2006/picture">
                   <pic:nvPicPr>
-                    <pic:cNvPr id="1020297675" name="Picture 1" descr="A screenshot of a computer&#10;&#10;AI-generated content may be incorrect."/>
+                    <pic:cNvPr id="385780445" name="Picture 385780445"/>
                     <pic:cNvPicPr/>
                   </pic:nvPicPr>
                   <pic:blipFill>
-                    <a:blip r:embed="rId5"/>
+                    <a:blip r:embed="rId7" cstate="print">
+                      <a:extLst>
+                        <a:ext uri="{28A0092B-C50C-407E-A947-70E740481C1C}">
+                          <a14:useLocalDpi xmlns:a14="http://schemas.microsoft.com/office/drawing/2010/main" val="0"/>
+                        </a:ext>
+                      </a:extLst>
+                    </a:blip>
                     <a:stretch>
                       <a:fillRect/>
                     </a:stretch>
@@ -166,7 +277,7 @@
                   <pic:spPr>
                     <a:xfrm>
                       <a:off x="0" y="0"/>
-                      <a:ext cx="5943600" cy="3159125"/>
+                      <a:ext cx="5943600" cy="2854325"/>
                     </a:xfrm>
                     <a:prstGeom prst="rect">
                       <a:avLst/>
@@ -181,10 +292,459 @@
     </w:p>
     <w:p>
       <w:pPr>
-        <w:rPr>
-          <w:lang w:val="vi-VN"/>
-        </w:rPr>
-      </w:pPr>
+        <w:pStyle w:val="Caption"/>
+        <w:jc w:val="center"/>
+        <w:rPr>
+          <w:rFonts w:ascii="Times New Roman" w:hAnsi="Times New Roman" w:cs="Times New Roman"/>
+          <w:lang w:val="vi-VN"/>
+        </w:rPr>
+      </w:pPr>
+      <w:r>
+        <w:rPr>
+          <w:rFonts w:ascii="Times New Roman" w:hAnsi="Times New Roman" w:cs="Times New Roman"/>
+        </w:rPr>
+        <w:t xml:space="preserve">Hình </w:t>
+      </w:r>
+      <w:r>
+        <w:rPr>
+          <w:rFonts w:ascii="Times New Roman" w:hAnsi="Times New Roman" w:cs="Times New Roman"/>
+        </w:rPr>
+        <w:fldChar w:fldCharType="begin"/>
+      </w:r>
+      <w:r>
+        <w:rPr>
+          <w:rFonts w:ascii="Times New Roman" w:hAnsi="Times New Roman" w:cs="Times New Roman"/>
+        </w:rPr>
+        <w:instrText xml:space="preserve"> SEQ Hình \* ARABIC </w:instrText>
+      </w:r>
+      <w:r>
+        <w:rPr>
+          <w:rFonts w:ascii="Times New Roman" w:hAnsi="Times New Roman" w:cs="Times New Roman"/>
+        </w:rPr>
+        <w:fldChar w:fldCharType="separate"/>
+      </w:r>
+      <w:r>
+        <w:rPr>
+          <w:rFonts w:ascii="Times New Roman" w:hAnsi="Times New Roman" w:cs="Times New Roman"/>
+          <w:noProof/>
+        </w:rPr>
+        <w:t>2</w:t>
+      </w:r>
+      <w:r>
+        <w:rPr>
+          <w:rFonts w:ascii="Times New Roman" w:hAnsi="Times New Roman" w:cs="Times New Roman"/>
+        </w:rPr>
+        <w:fldChar w:fldCharType="end"/>
+      </w:r>
+      <w:r>
+        <w:rPr>
+          <w:rFonts w:ascii="Times New Roman" w:hAnsi="Times New Roman" w:cs="Times New Roman"/>
+          <w:lang w:val="vi-VN"/>
+        </w:rPr>
+        <w:t>. Kiểm tra kết nối từ Kali Linux đến Windows 10</w:t>
+      </w:r>
+    </w:p>
+    <w:p>
+      <w:pPr>
+        <w:ind w:firstLine="720"/>
+        <w:rPr>
+          <w:rFonts w:ascii="Times New Roman" w:hAnsi="Times New Roman" w:cs="Times New Roman"/>
+          <w:sz w:val="26"/>
+          <w:szCs w:val="26"/>
+          <w:lang w:val="vi-VN"/>
+        </w:rPr>
+      </w:pPr>
+      <w:r>
+        <w:rPr>
+          <w:rFonts w:ascii="Times New Roman" w:hAnsi="Times New Roman" w:cs="Times New Roman"/>
+          <w:sz w:val="26"/>
+          <w:szCs w:val="26"/>
+          <w:lang w:val="vi-VN"/>
+        </w:rPr>
+        <w:t xml:space="preserve">Thực hiện lệnh ping 10.0.0.2 trên Kali Linux để kiểm tra kết nối ngược lại đến Windows 10. </w:t>
+      </w:r>
+      <w:r>
+        <w:rPr>
+          <w:rFonts w:ascii="Times New Roman" w:hAnsi="Times New Roman" w:cs="Times New Roman"/>
+          <w:sz w:val="26"/>
+          <w:szCs w:val="26"/>
+        </w:rPr>
+        <w:t>Kết quả nhận được 27/27 gói tin, không mất gói.</w:t>
+      </w:r>
+    </w:p>
+    <w:p>
+      <w:pPr>
+        <w:pStyle w:val="ListParagraph"/>
+        <w:numPr>
+          <w:ilvl w:val="0"/>
+          <w:numId w:val="1"/>
+        </w:numPr>
+        <w:rPr>
+          <w:rFonts w:ascii="Times New Roman" w:hAnsi="Times New Roman" w:cs="Times New Roman"/>
+          <w:b/>
+          <w:bCs/>
+          <w:lang w:val="vi-VN"/>
+        </w:rPr>
+      </w:pPr>
+      <w:r>
+        <w:rPr>
+          <w:rFonts w:ascii="Times New Roman" w:hAnsi="Times New Roman" w:cs="Times New Roman"/>
+          <w:b/>
+          <w:bCs/>
+          <w:lang w:val="vi-VN"/>
+        </w:rPr>
+        <w:br w:type="column"/>
+      </w:r>
+      <w:r>
+        <w:rPr>
+          <w:rFonts w:ascii="Times New Roman" w:hAnsi="Times New Roman" w:cs="Times New Roman"/>
+          <w:b/>
+          <w:bCs/>
+          <w:lang w:val="vi-VN"/>
+        </w:rPr>
+        <w:lastRenderedPageBreak/>
+        <w:t>Đăng nhập SSH và thực hiện lệnh</w:t>
+      </w:r>
+    </w:p>
+    <w:p>
+      <w:pPr>
+        <w:keepNext/>
+        <w:ind w:left="360"/>
+      </w:pPr>
+      <w:r>
+        <w:rPr>
+          <w:rFonts w:ascii="Times New Roman" w:hAnsi="Times New Roman" w:cs="Times New Roman"/>
+          <w:noProof/>
+          <w:lang w:val="vi-VN"/>
+        </w:rPr>
+        <w:drawing>
+          <wp:inline distT="0" distB="0" distL="0" distR="0" wp14:anchorId="648C1DF8" wp14:editId="5FFBD7AD">
+            <wp:extent cx="5943600" cy="4457700"/>
+            <wp:effectExtent l="0" t="0" r="0" b="0"/>
+            <wp:docPr id="252612942" name="Picture 3" descr="A screenshot of a computer&#10;&#10;AI-generated content may be incorrect."/>
+            <wp:cNvGraphicFramePr>
+              <a:graphicFrameLocks xmlns:a="http://schemas.openxmlformats.org/drawingml/2006/main" noChangeAspect="1"/>
+            </wp:cNvGraphicFramePr>
+            <a:graphic xmlns:a="http://schemas.openxmlformats.org/drawingml/2006/main">
+              <a:graphicData uri="http://schemas.openxmlformats.org/drawingml/2006/picture">
+                <pic:pic xmlns:pic="http://schemas.openxmlformats.org/drawingml/2006/picture">
+                  <pic:nvPicPr>
+                    <pic:cNvPr id="252612942" name="Picture 3" descr="A screenshot of a computer&#10;&#10;AI-generated content may be incorrect."/>
+                    <pic:cNvPicPr/>
+                  </pic:nvPicPr>
+                  <pic:blipFill>
+                    <a:blip r:embed="rId8">
+                      <a:extLst>
+                        <a:ext uri="{28A0092B-C50C-407E-A947-70E740481C1C}">
+                          <a14:useLocalDpi xmlns:a14="http://schemas.microsoft.com/office/drawing/2010/main" val="0"/>
+                        </a:ext>
+                      </a:extLst>
+                    </a:blip>
+                    <a:stretch>
+                      <a:fillRect/>
+                    </a:stretch>
+                  </pic:blipFill>
+                  <pic:spPr>
+                    <a:xfrm>
+                      <a:off x="0" y="0"/>
+                      <a:ext cx="5943600" cy="4457700"/>
+                    </a:xfrm>
+                    <a:prstGeom prst="rect">
+                      <a:avLst/>
+                    </a:prstGeom>
+                  </pic:spPr>
+                </pic:pic>
+              </a:graphicData>
+            </a:graphic>
+          </wp:inline>
+        </w:drawing>
+      </w:r>
+    </w:p>
+    <w:p>
+      <w:pPr>
+        <w:pStyle w:val="Caption"/>
+        <w:jc w:val="center"/>
+        <w:rPr>
+          <w:rFonts w:ascii="Times New Roman" w:hAnsi="Times New Roman" w:cs="Times New Roman"/>
+          <w:lang w:val="vi-VN"/>
+        </w:rPr>
+      </w:pPr>
+      <w:r>
+        <w:rPr>
+          <w:rFonts w:ascii="Times New Roman" w:hAnsi="Times New Roman" w:cs="Times New Roman"/>
+        </w:rPr>
+        <w:t xml:space="preserve">Hình </w:t>
+      </w:r>
+      <w:r>
+        <w:rPr>
+          <w:rFonts w:ascii="Times New Roman" w:hAnsi="Times New Roman" w:cs="Times New Roman"/>
+        </w:rPr>
+        <w:fldChar w:fldCharType="begin"/>
+      </w:r>
+      <w:r>
+        <w:rPr>
+          <w:rFonts w:ascii="Times New Roman" w:hAnsi="Times New Roman" w:cs="Times New Roman"/>
+        </w:rPr>
+        <w:instrText xml:space="preserve"> SEQ Hình \* ARABIC </w:instrText>
+      </w:r>
+      <w:r>
+        <w:rPr>
+          <w:rFonts w:ascii="Times New Roman" w:hAnsi="Times New Roman" w:cs="Times New Roman"/>
+        </w:rPr>
+        <w:fldChar w:fldCharType="separate"/>
+      </w:r>
+      <w:r>
+        <w:rPr>
+          <w:rFonts w:ascii="Times New Roman" w:hAnsi="Times New Roman" w:cs="Times New Roman"/>
+          <w:noProof/>
+        </w:rPr>
+        <w:t>3</w:t>
+      </w:r>
+      <w:r>
+        <w:rPr>
+          <w:rFonts w:ascii="Times New Roman" w:hAnsi="Times New Roman" w:cs="Times New Roman"/>
+        </w:rPr>
+        <w:fldChar w:fldCharType="end"/>
+      </w:r>
+      <w:r>
+        <w:rPr>
+          <w:rFonts w:ascii="Times New Roman" w:hAnsi="Times New Roman" w:cs="Times New Roman"/>
+          <w:lang w:val="vi-VN"/>
+        </w:rPr>
+        <w:t>. Kết nối SSH từ Windows 10 đến Kali Linux bằng PuTTy</w:t>
+      </w:r>
+    </w:p>
+    <w:p>
+      <w:pPr>
+        <w:ind w:firstLine="720"/>
+        <w:rPr>
+          <w:rFonts w:ascii="Times New Roman" w:hAnsi="Times New Roman" w:cs="Times New Roman"/>
+          <w:sz w:val="26"/>
+          <w:szCs w:val="26"/>
+          <w:lang w:val="vi-VN"/>
+        </w:rPr>
+      </w:pPr>
+      <w:r>
+        <w:rPr>
+          <w:rFonts w:ascii="Times New Roman" w:hAnsi="Times New Roman" w:cs="Times New Roman"/>
+          <w:sz w:val="26"/>
+          <w:szCs w:val="26"/>
+          <w:lang w:val="vi-VN"/>
+        </w:rPr>
+        <w:t>Sử dụng PuTTY trên Windows 10 để kết nối SSH đến Kali Linux với địa chỉ 10.0.0.3. Sau khi đăng nhập, thực hiện các lệnh whoami, pwd, ls và echo Lab1 để kiểm tra phiên làm việc SSH.</w:t>
+      </w:r>
+    </w:p>
+    <w:p>
+      <w:pPr>
+        <w:pStyle w:val="ListParagraph"/>
+        <w:numPr>
+          <w:ilvl w:val="0"/>
+          <w:numId w:val="1"/>
+        </w:numPr>
+        <w:rPr>
+          <w:rFonts w:ascii="Times New Roman" w:hAnsi="Times New Roman" w:cs="Times New Roman"/>
+          <w:b/>
+          <w:bCs/>
+          <w:lang w:val="vi-VN"/>
+        </w:rPr>
+      </w:pPr>
+      <w:r>
+        <w:rPr>
+          <w:rFonts w:ascii="Times New Roman" w:hAnsi="Times New Roman" w:cs="Times New Roman"/>
+          <w:b/>
+          <w:bCs/>
+          <w:lang w:val="vi-VN"/>
+        </w:rPr>
+        <w:br w:type="column"/>
+      </w:r>
+      <w:r>
+        <w:rPr>
+          <w:rFonts w:ascii="Times New Roman" w:hAnsi="Times New Roman" w:cs="Times New Roman"/>
+          <w:b/>
+          <w:bCs/>
+          <w:lang w:val="vi-VN"/>
+        </w:rPr>
+        <w:lastRenderedPageBreak/>
+        <w:t>Bắt gói SSH bằng WireShark</w:t>
+      </w:r>
+    </w:p>
+    <w:p>
+      <w:pPr>
+        <w:keepNext/>
+        <w:ind w:left="360"/>
+      </w:pPr>
+      <w:r>
+        <w:rPr>
+          <w:rFonts w:ascii="Times New Roman" w:hAnsi="Times New Roman" w:cs="Times New Roman"/>
+          <w:b/>
+          <w:bCs/>
+          <w:noProof/>
+          <w:lang w:val="vi-VN"/>
+        </w:rPr>
+        <w:drawing>
+          <wp:inline distT="0" distB="0" distL="0" distR="0" wp14:anchorId="2FC8AD9D" wp14:editId="76B5F930">
+            <wp:extent cx="5943600" cy="2854325"/>
+            <wp:effectExtent l="0" t="0" r="0" b="3175"/>
+            <wp:docPr id="570056294" name="Picture 4" descr="A screenshot of a computer&#10;&#10;AI-generated content may be incorrect."/>
+            <wp:cNvGraphicFramePr>
+              <a:graphicFrameLocks xmlns:a="http://schemas.openxmlformats.org/drawingml/2006/main" noChangeAspect="1"/>
+            </wp:cNvGraphicFramePr>
+            <a:graphic xmlns:a="http://schemas.openxmlformats.org/drawingml/2006/main">
+              <a:graphicData uri="http://schemas.openxmlformats.org/drawingml/2006/picture">
+                <pic:pic xmlns:pic="http://schemas.openxmlformats.org/drawingml/2006/picture">
+                  <pic:nvPicPr>
+                    <pic:cNvPr id="570056294" name="Picture 4" descr="A screenshot of a computer&#10;&#10;AI-generated content may be incorrect."/>
+                    <pic:cNvPicPr/>
+                  </pic:nvPicPr>
+                  <pic:blipFill>
+                    <a:blip r:embed="rId9" cstate="print">
+                      <a:extLst>
+                        <a:ext uri="{28A0092B-C50C-407E-A947-70E740481C1C}">
+                          <a14:useLocalDpi xmlns:a14="http://schemas.microsoft.com/office/drawing/2010/main" val="0"/>
+                        </a:ext>
+                      </a:extLst>
+                    </a:blip>
+                    <a:stretch>
+                      <a:fillRect/>
+                    </a:stretch>
+                  </pic:blipFill>
+                  <pic:spPr>
+                    <a:xfrm>
+                      <a:off x="0" y="0"/>
+                      <a:ext cx="5943600" cy="2854325"/>
+                    </a:xfrm>
+                    <a:prstGeom prst="rect">
+                      <a:avLst/>
+                    </a:prstGeom>
+                  </pic:spPr>
+                </pic:pic>
+              </a:graphicData>
+            </a:graphic>
+          </wp:inline>
+        </w:drawing>
+      </w:r>
+    </w:p>
+    <w:p>
+      <w:pPr>
+        <w:pStyle w:val="Caption"/>
+        <w:jc w:val="center"/>
+        <w:rPr>
+          <w:rFonts w:ascii="Times New Roman" w:hAnsi="Times New Roman" w:cs="Times New Roman"/>
+          <w:b/>
+          <w:bCs/>
+          <w:lang w:val="vi-VN"/>
+        </w:rPr>
+      </w:pPr>
+      <w:r>
+        <w:rPr>
+          <w:rFonts w:ascii="Times New Roman" w:hAnsi="Times New Roman" w:cs="Times New Roman"/>
+        </w:rPr>
+        <w:t xml:space="preserve">Hình </w:t>
+      </w:r>
+      <w:r>
+        <w:rPr>
+          <w:rFonts w:ascii="Times New Roman" w:hAnsi="Times New Roman" w:cs="Times New Roman"/>
+        </w:rPr>
+        <w:fldChar w:fldCharType="begin"/>
+      </w:r>
+      <w:r>
+        <w:rPr>
+          <w:rFonts w:ascii="Times New Roman" w:hAnsi="Times New Roman" w:cs="Times New Roman"/>
+        </w:rPr>
+        <w:instrText xml:space="preserve"> SEQ Hình \* ARABIC </w:instrText>
+      </w:r>
+      <w:r>
+        <w:rPr>
+          <w:rFonts w:ascii="Times New Roman" w:hAnsi="Times New Roman" w:cs="Times New Roman"/>
+        </w:rPr>
+        <w:fldChar w:fldCharType="separate"/>
+      </w:r>
+      <w:r>
+        <w:rPr>
+          <w:rFonts w:ascii="Times New Roman" w:hAnsi="Times New Roman" w:cs="Times New Roman"/>
+          <w:noProof/>
+        </w:rPr>
+        <w:t>4</w:t>
+      </w:r>
+      <w:r>
+        <w:rPr>
+          <w:rFonts w:ascii="Times New Roman" w:hAnsi="Times New Roman" w:cs="Times New Roman"/>
+        </w:rPr>
+        <w:fldChar w:fldCharType="end"/>
+      </w:r>
+      <w:r>
+        <w:rPr>
+          <w:rFonts w:ascii="Times New Roman" w:hAnsi="Times New Roman" w:cs="Times New Roman"/>
+          <w:lang w:val="vi-VN"/>
+        </w:rPr>
+        <w:t>. Bắt và phân tích SSH trên WireShark</w:t>
+      </w:r>
+    </w:p>
+    <w:p>
+      <w:pPr>
+        <w:ind w:left="360" w:firstLine="360"/>
+        <w:rPr>
+          <w:rFonts w:ascii="Times New Roman" w:hAnsi="Times New Roman" w:cs="Times New Roman"/>
+          <w:lang w:val="vi-VN"/>
+        </w:rPr>
+      </w:pPr>
+      <w:r>
+        <w:rPr>
+          <w:rFonts w:ascii="Times New Roman" w:hAnsi="Times New Roman" w:cs="Times New Roman"/>
+          <w:lang w:val="vi-VN"/>
+        </w:rPr>
+        <w:t>Sử dụng Wireshark trên Kali Linux để bắt lưu lượng SSH với bộ lọc tcp.port == 22. Kết quả cho thấy các gói tin trao đổi giữa 10.0.0.2 và 10.0.0.3, bao gồm quá trình thiết lập kết nối TCP, trao đổi SSH và các gói tin được mã hóa.</w:t>
+      </w:r>
+    </w:p>
+    <w:p>
+      <w:pPr>
+        <w:rPr>
+          <w:rFonts w:ascii="Times New Roman" w:hAnsi="Times New Roman" w:cs="Times New Roman"/>
+          <w:b/>
+          <w:bCs/>
+          <w:color w:val="EE0000"/>
+          <w:lang w:val="vi-VN"/>
+        </w:rPr>
+      </w:pPr>
+      <w:r>
+        <w:rPr>
+          <w:rFonts w:ascii="Times New Roman" w:hAnsi="Times New Roman" w:cs="Times New Roman"/>
+          <w:b/>
+          <w:bCs/>
+          <w:color w:val="EE0000"/>
+          <w:lang w:val="vi-VN"/>
+        </w:rPr>
+        <w:t xml:space="preserve">LINK YOUTUBE: </w:t>
+      </w:r>
+      <w:hyperlink r:id="rId10" w:history="1">
+        <w:r>
+          <w:rPr>
+            <w:rStyle w:val="Hyperlink"/>
+            <w:rFonts w:ascii="Times New Roman" w:hAnsi="Times New Roman" w:cs="Times New Roman"/>
+            <w:color w:val="0070C0"/>
+            <w:lang w:val="vi-VN"/>
+          </w:rPr>
+          <w:t>https://www.youtube.com/watch</w:t>
+        </w:r>
+        <w:r>
+          <w:rPr>
+            <w:rStyle w:val="Hyperlink"/>
+            <w:rFonts w:ascii="Times New Roman" w:hAnsi="Times New Roman" w:cs="Times New Roman"/>
+            <w:color w:val="0070C0"/>
+            <w:lang w:val="vi-VN"/>
+          </w:rPr>
+          <w:t>?</w:t>
+        </w:r>
+        <w:r>
+          <w:rPr>
+            <w:rStyle w:val="Hyperlink"/>
+            <w:rFonts w:ascii="Times New Roman" w:hAnsi="Times New Roman" w:cs="Times New Roman"/>
+            <w:color w:val="0070C0"/>
+            <w:lang w:val="vi-VN"/>
+          </w:rPr>
+          <w:t>v=cY9uXUaRJpA</w:t>
+        </w:r>
+      </w:hyperlink>
     </w:p>
     <w:sectPr>
       <w:pgSz w:w="12240" w:h="15840"/>
@@ -194,6 +754,103 @@
     </w:sectPr>
   </w:body>
 </w:document>
+</file>
+
+<file path=word/numbering.xml><?xml version="1.0" encoding="utf-8"?>
+<w:numbering xmlns:wpc="http://schemas.microsoft.com/office/word/2010/wordprocessingCanvas" xmlns:cx="http://schemas.microsoft.com/office/drawing/2014/chartex" xmlns:cx1="http://schemas.microsoft.com/office/drawing/2015/9/8/chartex" xmlns:cx2="http://schemas.microsoft.com/office/drawing/2015/10/21/chartex" xmlns:cx3="http://schemas.microsoft.com/office/drawing/2016/5/9/chartex" xmlns:cx4="http://schemas.microsoft.com/office/drawing/2016/5/10/chartex" xmlns:cx5="http://schemas.microsoft.com/office/drawing/2016/5/11/chartex" xmlns:cx6="http://schemas.microsoft.com/office/drawing/2016/5/12/chartex" xmlns:cx7="http://schemas.microsoft.com/office/drawing/2016/5/13/chartex" xmlns:cx8="http://schemas.microsoft.com/office/drawing/2016/5/14/chartex" xmlns:mc="http://schemas.openxmlformats.org/markup-compatibility/2006" xmlns:aink="http://schemas.microsoft.com/office/drawing/2016/ink" xmlns:am3d="http://schemas.microsoft.com/office/drawing/2017/model3d" xmlns:o="urn:schemas-microsoft-com:office:office" xmlns:oel="http://schemas.microsoft.com/office/2019/extlst" xmlns:r="http://schemas.openxmlformats.org/officeDocument/2006/relationships" xmlns:m="http://schemas.openxmlformats.org/officeDocument/2006/math" xmlns:v="urn:schemas-microsoft-com:vml" xmlns:wp14="http://schemas.microsoft.com/office/word/2010/wordprocessingDrawing" xmlns:wp="http://schemas.openxmlformats.org/drawingml/2006/wordprocessingDrawing" xmlns:w10="urn:schemas-microsoft-com:office:word" xmlns:w="http://schemas.openxmlformats.org/wordprocessingml/2006/main" xmlns:w14="http://schemas.microsoft.com/office/word/2010/wordml" xmlns:w15="http://schemas.microsoft.com/office/word/2012/wordml" xmlns:w16cex="http://schemas.microsoft.com/office/word/2018/wordml/cex" xmlns:w16cid="http://schemas.microsoft.com/office/word/2016/wordml/cid" xmlns:w16="http://schemas.microsoft.com/office/word/2018/wordml" xmlns:w16du="http://schemas.microsoft.com/office/word/2023/wordml/word16du" xmlns:w16sdtdh="http://schemas.microsoft.com/office/word/2020/wordml/sdtdatahash" xmlns:w16sdtfl="http://schemas.microsoft.com/office/word/2024/wordml/sdtformatlock" xmlns:w16se="http://schemas.microsoft.com/office/word/2015/wordml/symex" xmlns:wpg="http://schemas.microsoft.com/office/word/2010/wordprocessingGroup" xmlns:wpi="http://schemas.microsoft.com/office/word/2010/wordprocessingInk" xmlns:wne="http://schemas.microsoft.com/office/word/2006/wordml" xmlns:wps="http://schemas.microsoft.com/office/word/2010/wordprocessingShape" mc:Ignorable="w14 w15 w16se w16cid w16 w16cex w16sdtdh w16sdtfl w16du wp14">
+  <w:abstractNum w:abstractNumId="0" w15:restartNumberingAfterBreak="0">
+    <w:nsid w:val="35EC6399"/>
+    <w:multiLevelType w:val="hybridMultilevel"/>
+    <w:tmpl w:val="4FEA4344"/>
+    <w:lvl w:ilvl="0" w:tplc="0409000F">
+      <w:start w:val="1"/>
+      <w:numFmt w:val="decimal"/>
+      <w:lvlText w:val="%1."/>
+      <w:lvlJc w:val="left"/>
+      <w:pPr>
+        <w:ind w:left="720" w:hanging="360"/>
+      </w:pPr>
+      <w:rPr>
+        <w:rFonts w:hint="default"/>
+      </w:rPr>
+    </w:lvl>
+    <w:lvl w:ilvl="1" w:tplc="04090019" w:tentative="1">
+      <w:start w:val="1"/>
+      <w:numFmt w:val="lowerLetter"/>
+      <w:lvlText w:val="%2."/>
+      <w:lvlJc w:val="left"/>
+      <w:pPr>
+        <w:ind w:left="1440" w:hanging="360"/>
+      </w:pPr>
+    </w:lvl>
+    <w:lvl w:ilvl="2" w:tplc="0409001B" w:tentative="1">
+      <w:start w:val="1"/>
+      <w:numFmt w:val="lowerRoman"/>
+      <w:lvlText w:val="%3."/>
+      <w:lvlJc w:val="right"/>
+      <w:pPr>
+        <w:ind w:left="2160" w:hanging="180"/>
+      </w:pPr>
+    </w:lvl>
+    <w:lvl w:ilvl="3" w:tplc="0409000F" w:tentative="1">
+      <w:start w:val="1"/>
+      <w:numFmt w:val="decimal"/>
+      <w:lvlText w:val="%4."/>
+      <w:lvlJc w:val="left"/>
+      <w:pPr>
+        <w:ind w:left="2880" w:hanging="360"/>
+      </w:pPr>
+    </w:lvl>
+    <w:lvl w:ilvl="4" w:tplc="04090019" w:tentative="1">
+      <w:start w:val="1"/>
+      <w:numFmt w:val="lowerLetter"/>
+      <w:lvlText w:val="%5."/>
+      <w:lvlJc w:val="left"/>
+      <w:pPr>
+        <w:ind w:left="3600" w:hanging="360"/>
+      </w:pPr>
+    </w:lvl>
+    <w:lvl w:ilvl="5" w:tplc="0409001B" w:tentative="1">
+      <w:start w:val="1"/>
+      <w:numFmt w:val="lowerRoman"/>
+      <w:lvlText w:val="%6."/>
+      <w:lvlJc w:val="right"/>
+      <w:pPr>
+        <w:ind w:left="4320" w:hanging="180"/>
+      </w:pPr>
+    </w:lvl>
+    <w:lvl w:ilvl="6" w:tplc="0409000F" w:tentative="1">
+      <w:start w:val="1"/>
+      <w:numFmt w:val="decimal"/>
+      <w:lvlText w:val="%7."/>
+      <w:lvlJc w:val="left"/>
+      <w:pPr>
+        <w:ind w:left="5040" w:hanging="360"/>
+      </w:pPr>
+    </w:lvl>
+    <w:lvl w:ilvl="7" w:tplc="04090019" w:tentative="1">
+      <w:start w:val="1"/>
+      <w:numFmt w:val="lowerLetter"/>
+      <w:lvlText w:val="%8."/>
+      <w:lvlJc w:val="left"/>
+      <w:pPr>
+        <w:ind w:left="5760" w:hanging="360"/>
+      </w:pPr>
+    </w:lvl>
+    <w:lvl w:ilvl="8" w:tplc="0409001B" w:tentative="1">
+      <w:start w:val="1"/>
+      <w:numFmt w:val="lowerRoman"/>
+      <w:lvlText w:val="%9."/>
+      <w:lvlJc w:val="right"/>
+      <w:pPr>
+        <w:ind w:left="6480" w:hanging="180"/>
+      </w:pPr>
+    </w:lvl>
+  </w:abstractNum>
+  <w:num w:numId="1" w16cid:durableId="292446258">
+    <w:abstractNumId w:val="0"/>
+  </w:num>
+</w:numbering>
 </file>
 
 <file path=word/styles.xml><?xml version="1.0" encoding="utf-8"?>
@@ -1112,6 +1769,60 @@
       <w:spacing w:val="5"/>
     </w:rPr>
   </w:style>
+  <w:style w:type="paragraph" w:styleId="Caption">
+    <w:name w:val="caption"/>
+    <w:basedOn w:val="Normal"/>
+    <w:next w:val="Normal"/>
+    <w:uiPriority w:val="35"/>
+    <w:unhideWhenUsed/>
+    <w:qFormat/>
+    <w:rsid w:val="001122DE"/>
+    <w:pPr>
+      <w:spacing w:after="200" w:line="240" w:lineRule="auto"/>
+    </w:pPr>
+    <w:rPr>
+      <w:i/>
+      <w:iCs/>
+      <w:color w:val="0E2841" w:themeColor="text2"/>
+      <w:sz w:val="18"/>
+      <w:szCs w:val="18"/>
+    </w:rPr>
+  </w:style>
+  <w:style w:type="character" w:styleId="Hyperlink">
+    <w:name w:val="Hyperlink"/>
+    <w:basedOn w:val="DefaultParagraphFont"/>
+    <w:uiPriority w:val="99"/>
+    <w:unhideWhenUsed/>
+    <w:rsid w:val="001122DE"/>
+    <w:rPr>
+      <w:color w:val="467886" w:themeColor="hyperlink"/>
+      <w:u w:val="single"/>
+    </w:rPr>
+  </w:style>
+  <w:style w:type="character" w:styleId="UnresolvedMention">
+    <w:name w:val="Unresolved Mention"/>
+    <w:basedOn w:val="DefaultParagraphFont"/>
+    <w:uiPriority w:val="99"/>
+    <w:semiHidden/>
+    <w:unhideWhenUsed/>
+    <w:rsid w:val="001122DE"/>
+    <w:rPr>
+      <w:color w:val="605E5C"/>
+      <w:shd w:val="clear" w:color="auto" w:fill="E1DFDD"/>
+    </w:rPr>
+  </w:style>
+  <w:style w:type="character" w:styleId="FollowedHyperlink">
+    <w:name w:val="FollowedHyperlink"/>
+    <w:basedOn w:val="DefaultParagraphFont"/>
+    <w:uiPriority w:val="99"/>
+    <w:semiHidden/>
+    <w:unhideWhenUsed/>
+    <w:rsid w:val="001122DE"/>
+    <w:rPr>
+      <w:color w:val="96607D" w:themeColor="followedHyperlink"/>
+      <w:u w:val="single"/>
+    </w:rPr>
+  </w:style>
 </w:styles>
 </file>
 
@@ -1428,4 +2139,16 @@
     </a:ext>
   </a:extLst>
 </a:theme>
+</file>
+
+<file path=customXml/item1.xml><?xml version="1.0" encoding="utf-8"?>
+<b:Sources xmlns:b="http://schemas.openxmlformats.org/officeDocument/2006/bibliography" xmlns="http://schemas.openxmlformats.org/officeDocument/2006/bibliography" SelectedStyle="\APASixthEditionOfficeOnline.xsl" StyleName="APA" Version="6"/>
+</file>
+
+<file path=customXml/itemProps1.xml><?xml version="1.0" encoding="utf-8"?>
+<ds:datastoreItem xmlns:ds="http://schemas.openxmlformats.org/officeDocument/2006/customXml" ds:itemID="{1BEF9E70-C795-4D26-AC6F-E3750B0F6AC6}">
+  <ds:schemaRefs>
+    <ds:schemaRef ds:uri="http://schemas.openxmlformats.org/officeDocument/2006/bibliography"/>
+  </ds:schemaRefs>
+</ds:datastoreItem>
 </file>
</xml_diff>